<commit_message>
Added info under future work heading
</commit_message>
<xml_diff>
--- a/Documentation/Design_Document_-_final.docx
+++ b/Documentation/Design_Document_-_final.docx
@@ -2414,7 +2414,19 @@
         <w:t>It c</w:t>
       </w:r>
       <w:r>
-        <w:t>onnects to the OpenAQ API to fetch real-time air quality data. It retrieves JSON responses containing metrics like PM2.5 and PM10. The handler is responsible for converting this data into a format usable by the visualization components.</w:t>
+        <w:t xml:space="preserve">onnects to the OpenAQ API to fetch real-time air quality data. </w:t>
+      </w:r>
+      <w:r>
+        <w:t>The handler</w:t>
+      </w:r>
+      <w:r>
+        <w:t xml:space="preserve"> retrieves JSON responses containing metrics like PM2.5 and PM10. </w:t>
+      </w:r>
+      <w:r>
+        <w:t>It</w:t>
+      </w:r>
+      <w:r>
+        <w:t xml:space="preserve"> is responsible for converting this data into a format usable by the visualization components.</w:t>
       </w:r>
     </w:p>
     <w:p>
@@ -8182,15 +8194,15 @@
           <w:lang w:val="en-GB"/>
         </w:rPr>
       </w:pPr>
-      <w:bookmarkStart w:id="11" w:name="_Hlk180952404"/>
-      <w:bookmarkStart w:id="12" w:name="_Toc183971796"/>
+      <w:bookmarkStart w:id="11" w:name="_Toc183971796"/>
+      <w:bookmarkStart w:id="12" w:name="_Hlk180952404"/>
       <w:r>
         <w:rPr>
           <w:lang w:val="en-GB"/>
         </w:rPr>
         <w:t>Self-Evaluation</w:t>
       </w:r>
-      <w:bookmarkEnd w:id="12"/>
+      <w:bookmarkEnd w:id="11"/>
     </w:p>
     <w:p>
       <w:r>
@@ -8987,6 +8999,9 @@
       <w:r>
         <w:t>Enhanced data visualization options</w:t>
       </w:r>
+      <w:r>
+        <w:t xml:space="preserve"> with more advanced history charts and dynamic icons.</w:t>
+      </w:r>
     </w:p>
     <w:p>
       <w:pPr>
@@ -9009,6 +9024,7 @@
         </w:numPr>
       </w:pPr>
       <w:r>
+        <w:lastRenderedPageBreak/>
         <w:t>Accessibility improvements</w:t>
       </w:r>
     </w:p>
@@ -9018,7 +9034,6 @@
         <w:ind w:left="0" w:firstLine="0"/>
       </w:pPr>
       <w:r>
-        <w:lastRenderedPageBreak/>
         <w:t xml:space="preserve">Performance Optimizations </w:t>
       </w:r>
     </w:p>
@@ -9332,7 +9347,7 @@
         <w:ind w:left="0" w:firstLine="0"/>
       </w:pPr>
       <w:bookmarkStart w:id="14" w:name="_Toc183971798"/>
-      <w:bookmarkEnd w:id="11"/>
+      <w:bookmarkEnd w:id="12"/>
       <w:r>
         <w:t>Conclusion</w:t>
       </w:r>
@@ -9392,14 +9407,14 @@
         </w:numPr>
         <w:ind w:left="0" w:firstLine="0"/>
       </w:pPr>
-      <w:bookmarkStart w:id="15" w:name="_Hlk183970994"/>
-      <w:bookmarkStart w:id="16" w:name="_Hlk183971326"/>
-      <w:bookmarkStart w:id="17" w:name="_Toc183971799"/>
+      <w:bookmarkStart w:id="15" w:name="_Toc183971799"/>
+      <w:bookmarkStart w:id="16" w:name="_Hlk183970994"/>
+      <w:bookmarkStart w:id="17" w:name="_Hlk183971326"/>
       <w:r>
         <w:lastRenderedPageBreak/>
         <w:t>Division of work</w:t>
       </w:r>
-      <w:bookmarkEnd w:id="17"/>
+      <w:bookmarkEnd w:id="15"/>
     </w:p>
     <w:p>
       <w:r>
@@ -9412,7 +9427,7 @@
         <w:t xml:space="preserve"> and backend, with each team member focusing on their assigned areas:</w:t>
       </w:r>
     </w:p>
-    <w:bookmarkEnd w:id="15"/>
+    <w:bookmarkEnd w:id="16"/>
     <w:p>
       <w:pPr>
         <w:numPr>
@@ -10148,7 +10163,7 @@
         <w:t>recent focus on cleanup, optimization, and final integration of components. The team maintained a balanced distribution of responsibilities between frontend and backend development, with clear ownership of specific components while collaborating effectively on shared objectives.</w:t>
       </w:r>
       <w:bookmarkEnd w:id="0"/>
-      <w:bookmarkEnd w:id="16"/>
+      <w:bookmarkEnd w:id="17"/>
     </w:p>
     <w:sectPr>
       <w:pgSz w:w="11906" w:h="16838"/>
@@ -21724,6 +21739,7 @@
   <w:style w:type="character" w:default="1" w:styleId="DefaultParagraphFont">
     <w:name w:val="Default Paragraph Font"/>
     <w:uiPriority w:val="1"/>
+    <w:semiHidden/>
     <w:unhideWhenUsed/>
   </w:style>
   <w:style w:type="table" w:default="1" w:styleId="TableNormal">

</xml_diff>